<commit_message>
update project - sidebar, upload improvements, validation, reports
</commit_message>
<xml_diff>
--- a/Undergraduate_Project_Template.docx
+++ b/Undergraduate_Project_Template.docx
@@ -11836,8 +11836,8 @@
           <w:szCs w:val="32"/>
         </w:rPr>
       </w:pPr>
-      <w:bookmarkStart w:id="4" w:name="_Hlk221793173"/>
-      <w:bookmarkStart w:id="5" w:name="_Toc221865503"/>
+      <w:bookmarkStart w:id="4" w:name="_Toc221865503"/>
+      <w:bookmarkStart w:id="5" w:name="_Hlk221793173"/>
       <w:r>
         <w:rPr>
           <w:sz w:val="32"/>
@@ -11846,7 +11846,7 @@
         <w:lastRenderedPageBreak/>
         <w:t>CHAPTER ONE</w:t>
       </w:r>
-      <w:bookmarkEnd w:id="5"/>
+      <w:bookmarkEnd w:id="4"/>
     </w:p>
     <w:p>
       <w:pPr>
@@ -24724,7 +24724,7 @@
         <w:t>he design presented in this chapter provides a technically sound, pedagogically appropriate, and practically feasible solution to the academic resource management challenges identified earlier. It balances innovation with practicality, ensuring the system will be both effective and sustainable.</w:t>
       </w:r>
     </w:p>
-    <w:bookmarkEnd w:id="4"/>
+    <w:bookmarkEnd w:id="5"/>
     <w:bookmarkEnd w:id="88"/>
     <w:p/>
     <w:p>
@@ -25577,13 +25577,161 @@
         <w:spacing w:after="160" w:line="278" w:lineRule="auto"/>
         <w:ind w:left="0" w:firstLine="0"/>
         <w:jc w:val="left"/>
+      </w:pPr>
+      <w:r>
+        <w:br w:type="page"/>
+      </w:r>
+    </w:p>
+    <w:p>
+      <w:pPr>
+        <w:spacing w:after="160" w:line="278" w:lineRule="auto"/>
+        <w:ind w:left="0" w:firstLine="0"/>
+        <w:jc w:val="left"/>
+      </w:pPr>
+    </w:p>
+    <w:p>
+      <w:pPr>
+        <w:spacing w:after="160" w:line="278" w:lineRule="auto"/>
+        <w:ind w:left="0" w:firstLine="0"/>
+        <w:jc w:val="left"/>
         <w:rPr>
           <w:b/>
           <w:sz w:val="28"/>
         </w:rPr>
       </w:pPr>
-      <w:r>
-        <w:br w:type="page"/>
+      <w:proofErr w:type="spellStart"/>
+      <w:r>
+        <w:rPr>
+          <w:b/>
+          <w:sz w:val="28"/>
+        </w:rPr>
+        <w:t>Pahlevi</w:t>
+      </w:r>
+      <w:proofErr w:type="spellEnd"/>
+      <w:r>
+        <w:rPr>
+          <w:b/>
+          <w:sz w:val="28"/>
+        </w:rPr>
+        <w:t xml:space="preserve">, T., Puspasari, D., Muhidin, S. A., Wulandari, S. S., Puspasari, D., &amp; </w:t>
+      </w:r>
+      <w:proofErr w:type="spellStart"/>
+      <w:r>
+        <w:rPr>
+          <w:b/>
+          <w:sz w:val="28"/>
+        </w:rPr>
+        <w:t>Panduwinata</w:t>
+      </w:r>
+      <w:proofErr w:type="spellEnd"/>
+      <w:r>
+        <w:rPr>
+          <w:b/>
+          <w:sz w:val="28"/>
+        </w:rPr>
+        <w:t>, L. F. (2023, September). Skills and Responses of Student: Improving Learning Through Web-Based Archive Management Learning Media. In Proceedings of the International Seminar and Conference on Educational Technology (ISCET 2022) (p. 111). Springer Nature.</w:t>
+      </w:r>
+    </w:p>
+    <w:p>
+      <w:pPr>
+        <w:spacing w:after="160" w:line="278" w:lineRule="auto"/>
+        <w:ind w:left="0" w:firstLine="0"/>
+        <w:jc w:val="left"/>
+        <w:rPr>
+          <w:b/>
+          <w:sz w:val="28"/>
+        </w:rPr>
+      </w:pPr>
+    </w:p>
+    <w:p>
+      <w:pPr>
+        <w:spacing w:after="160" w:line="278" w:lineRule="auto"/>
+        <w:ind w:left="0" w:firstLine="0"/>
+        <w:jc w:val="left"/>
+        <w:rPr>
+          <w:b/>
+          <w:sz w:val="28"/>
+        </w:rPr>
+      </w:pPr>
+      <w:proofErr w:type="spellStart"/>
+      <w:r>
+        <w:rPr>
+          <w:b/>
+          <w:sz w:val="28"/>
+        </w:rPr>
+        <w:t>Ubaydullaeva</w:t>
+      </w:r>
+      <w:proofErr w:type="spellEnd"/>
+      <w:r>
+        <w:rPr>
+          <w:b/>
+          <w:sz w:val="28"/>
+        </w:rPr>
+        <w:t xml:space="preserve">, S., </w:t>
+      </w:r>
+      <w:proofErr w:type="spellStart"/>
+      <w:r>
+        <w:rPr>
+          <w:b/>
+          <w:sz w:val="28"/>
+        </w:rPr>
+        <w:t>Umurova</w:t>
+      </w:r>
+      <w:proofErr w:type="spellEnd"/>
+      <w:r>
+        <w:rPr>
+          <w:b/>
+          <w:sz w:val="28"/>
+        </w:rPr>
+        <w:t xml:space="preserve">, G., Botirova, S., </w:t>
+      </w:r>
+      <w:proofErr w:type="spellStart"/>
+      <w:r>
+        <w:rPr>
+          <w:b/>
+          <w:sz w:val="28"/>
+        </w:rPr>
+        <w:t>Yakhshiev</w:t>
+      </w:r>
+      <w:proofErr w:type="spellEnd"/>
+      <w:r>
+        <w:rPr>
+          <w:b/>
+          <w:sz w:val="28"/>
+        </w:rPr>
+        <w:t xml:space="preserve">, A., </w:t>
+      </w:r>
+      <w:proofErr w:type="spellStart"/>
+      <w:r>
+        <w:rPr>
+          <w:b/>
+          <w:sz w:val="28"/>
+        </w:rPr>
+        <w:t>Mavlyanova</w:t>
+      </w:r>
+      <w:proofErr w:type="spellEnd"/>
+      <w:r>
+        <w:rPr>
+          <w:b/>
+          <w:sz w:val="28"/>
+        </w:rPr>
+        <w:t xml:space="preserve">, U., Nazirova, S., ... &amp; Kim, O. (2024). Modular Web-based Learning Model to Address Underdeveloped ICT Infrastructure for Smart E-learning Education System. J. Internet Serv. Inf. </w:t>
+      </w:r>
+      <w:proofErr w:type="spellStart"/>
+      <w:r>
+        <w:rPr>
+          <w:b/>
+          <w:sz w:val="28"/>
+        </w:rPr>
+        <w:t>Secur</w:t>
+      </w:r>
+      <w:proofErr w:type="spellEnd"/>
+      <w:r>
+        <w:rPr>
+          <w:b/>
+          <w:sz w:val="28"/>
+        </w:rPr>
+        <w:t>., 14(4), 450-461.</w:t>
       </w:r>
     </w:p>
     <w:p>
@@ -25593,7 +25741,6 @@
       </w:pPr>
       <w:bookmarkStart w:id="133" w:name="_Toc221865619"/>
       <w:r>
-        <w:lastRenderedPageBreak/>
         <w:t>REFERENCES</w:t>
       </w:r>
       <w:bookmarkEnd w:id="133"/>
@@ -25912,6 +26059,7 @@
         <w:rPr>
           <w:lang w:val="en-US"/>
         </w:rPr>
+        <w:lastRenderedPageBreak/>
         <w:t>Piaget, J. (1972). </w:t>
       </w:r>
       <w:r>
@@ -26028,7 +26176,6 @@
         <w:ind w:left="0" w:firstLine="0"/>
       </w:pPr>
       <w:r>
-        <w:lastRenderedPageBreak/>
         <w:t xml:space="preserve">Mobolaji, O. O. (2023). </w:t>
       </w:r>
       <w:r>
@@ -26215,6 +26362,7 @@
         <w:rPr>
           <w:lang w:val="en-US"/>
         </w:rPr>
+        <w:lastRenderedPageBreak/>
         <w:t>Chen, L. (2024). Academic amnesia: How LMS limitations affect longitudinal learning. </w:t>
       </w:r>
       <w:r>
@@ -26361,7 +26509,6 @@
         <w:rPr>
           <w:lang w:val="en-US"/>
         </w:rPr>
-        <w:lastRenderedPageBreak/>
         <w:t>Johnson, M. (2024). Post-pandemic blended learning: The need for integrated digital resources. </w:t>
       </w:r>
       <w:r>
@@ -26567,6 +26714,7 @@
         <w:rPr>
           <w:lang w:val="en-US"/>
         </w:rPr>
+        <w:lastRenderedPageBreak/>
         <w:t>Nkrumah, K. (2022). OER adaptation for Nigerian curriculum: A case study approach. </w:t>
       </w:r>
       <w:r>
@@ -26937,6 +27085,7 @@
         <w:rPr>
           <w:lang w:val="en-US"/>
         </w:rPr>
+        <w:lastRenderedPageBreak/>
         <w:t>Wang, H., Li, Q., &amp; Zhang, Y. (2023). Blended learning environments in post-pandemic education: Resource integration models. </w:t>
       </w:r>
       <w:r>
@@ -27230,6 +27379,7 @@
         <w:rPr>
           <w:lang w:val="en-US"/>
         </w:rPr>
+        <w:lastRenderedPageBreak/>
         <w:t>Ruby Rana. (2025, September 17). </w:t>
       </w:r>
       <w:r>
@@ -27413,7 +27563,6 @@
         <w:rPr>
           <w:lang w:val="en-US"/>
         </w:rPr>
-        <w:lastRenderedPageBreak/>
         <w:t>UNESCO. (2024). </w:t>
       </w:r>
       <w:r>
@@ -27498,6 +27647,7 @@
         </w:rPr>
       </w:pPr>
       <w:r>
+        <w:lastRenderedPageBreak/>
         <w:br w:type="page"/>
       </w:r>
     </w:p>
@@ -27699,12 +27849,14 @@
     <w:r>
       <w:fldChar w:fldCharType="separate"/>
     </w:r>
+    <w:proofErr w:type="spellStart"/>
     <w:r>
       <w:rPr>
         <w:sz w:val="22"/>
       </w:rPr>
       <w:t>i</w:t>
     </w:r>
+    <w:proofErr w:type="spellEnd"/>
     <w:r>
       <w:rPr>
         <w:sz w:val="22"/>

</xml_diff>